<commit_message>
Created a pgsql file for recreating the database used for testing locally. Created an outline for design goals with ezsaw3.1.0A and sketched a basic design for using pyqt.
</commit_message>
<xml_diff>
--- a/docs/DAW001 Analisys Wizard Design V3.1.0A.docx
+++ b/docs/DAW001 Analisys Wizard Design V3.1.0A.docx
@@ -437,6 +437,34 @@
           <w:u w:val="none"/>
         </w:rPr>
         <w:t>Postgresql (SQL database/implementation)</w:t>
+      </w:r>
+    </w:p>
+    <w:p>
+      <w:pPr>
+        <w:pStyle w:val="Normal"/>
+        <w:numPr>
+          <w:ilvl w:val="0"/>
+          <w:numId w:val="6"/>
+        </w:numPr>
+        <w:spacing w:lineRule="atLeast" w:line="300" w:before="0" w:after="0"/>
+        <w:rPr>
+          <w:b w:val="false"/>
+          <w:bCs w:val="false"/>
+          <w:i w:val="false"/>
+          <w:i w:val="false"/>
+          <w:iCs w:val="false"/>
+          <w:u w:val="none"/>
+        </w:rPr>
+      </w:pPr>
+      <w:r>
+        <w:rPr>
+          <w:b w:val="false"/>
+          <w:bCs w:val="false"/>
+          <w:i w:val="false"/>
+          <w:iCs w:val="false"/>
+          <w:u w:val="none"/>
+        </w:rPr>
+        <w:t>Sqllite (Database prototyping, quick implementation)</w:t>
       </w:r>
     </w:p>
     <w:p>
@@ -4594,7 +4622,7 @@
     <w:pPr>
       <w:widowControl/>
       <w:suppressAutoHyphens w:val="true"/>
-      <w:overflowPunct w:val="true"/>
+      <w:overflowPunct w:val="false"/>
       <w:bidi w:val="0"/>
       <w:spacing w:lineRule="auto" w:line="259" w:before="0" w:after="160"/>
       <w:jc w:val="left"/>
@@ -5122,7 +5150,7 @@
     <w:pPr>
       <w:widowControl/>
       <w:suppressAutoHyphens w:val="true"/>
-      <w:overflowPunct w:val="true"/>
+      <w:overflowPunct w:val="false"/>
       <w:bidi w:val="0"/>
       <w:spacing w:lineRule="auto" w:line="240" w:before="0" w:after="0"/>
       <w:jc w:val="left"/>

</xml_diff>